<commit_message>
fix format chapter 5 and 30% of chapter 3
</commit_message>
<xml_diff>
--- a/บทที่ 1.docx
+++ b/บทที่ 1.docx
@@ -1879,7 +1879,7 @@
         <w:spacing w:after="0"/>
         <w:jc w:val="thaiDistribute"/>
         <w:rPr>
-          <w:rFonts w:ascii="TH SarabunPSK" w:eastAsia="Times New Roman" w:hAnsi="TH SarabunPSK" w:cs="TH SarabunPSK" w:hint="cs"/>
+          <w:rFonts w:ascii="TH SarabunPSK" w:eastAsia="Times New Roman" w:hAnsi="TH SarabunPSK" w:cs="TH SarabunPSK"/>
           <w:kern w:val="0"/>
           <w:sz w:val="32"/>
           <w:szCs w:val="32"/>
@@ -2989,7 +2989,31 @@
           <w:cs/>
           <w14:ligatures w14:val="none"/>
         </w:rPr>
-        <w:t>ขอบเขตของพนักงานทั่วไป (</w:t>
+        <w:t>ขอบเขต</w:t>
+      </w:r>
+      <w:bookmarkStart w:id="0" w:name="_Hlk228047106"/>
+      <w:r>
+        <w:rPr>
+          <w:rFonts w:ascii="TH SarabunPSK" w:eastAsia="Times New Roman" w:hAnsi="TH SarabunPSK" w:cs="TH SarabunPSK"/>
+          <w:kern w:val="0"/>
+          <w:sz w:val="32"/>
+          <w:szCs w:val="32"/>
+          <w:cs/>
+          <w14:ligatures w14:val="none"/>
+        </w:rPr>
+        <w:t xml:space="preserve">ของพนักงานทั่วไป </w:t>
+      </w:r>
+      <w:bookmarkEnd w:id="0"/>
+      <w:r>
+        <w:rPr>
+          <w:rFonts w:ascii="TH SarabunPSK" w:eastAsia="Times New Roman" w:hAnsi="TH SarabunPSK" w:cs="TH SarabunPSK"/>
+          <w:kern w:val="0"/>
+          <w:sz w:val="32"/>
+          <w:szCs w:val="32"/>
+          <w:cs/>
+          <w14:ligatures w14:val="none"/>
+        </w:rPr>
+        <w:t>(</w:t>
       </w:r>
       <w:r>
         <w:rPr>
@@ -3240,8 +3264,21 @@
           <w:cs/>
           <w14:ligatures w14:val="none"/>
         </w:rPr>
-        <w:t>สามารถรับการแจ้งเตือนวาระสำคัญ เช่น วันคล้ายวันเกิดของตนเอง</w:t>
-      </w:r>
+        <w:t>สามารถรับ</w:t>
+      </w:r>
+      <w:bookmarkStart w:id="1" w:name="_Hlk228049672"/>
+      <w:r>
+        <w:rPr>
+          <w:rFonts w:ascii="TH SarabunPSK" w:eastAsia="Times New Roman" w:hAnsi="TH SarabunPSK" w:cs="TH SarabunPSK"/>
+          <w:kern w:val="0"/>
+          <w:sz w:val="32"/>
+          <w:szCs w:val="32"/>
+          <w:cs/>
+          <w14:ligatures w14:val="none"/>
+        </w:rPr>
+        <w:t>การแจ้งเตือนวาระสำคัญ เช่น วันคล้ายวันเกิดของตนเอง</w:t>
+      </w:r>
+      <w:bookmarkEnd w:id="1"/>
     </w:p>
     <w:p>
       <w:pPr>
@@ -3322,7 +3359,31 @@
           <w:cs/>
           <w14:ligatures w14:val="none"/>
         </w:rPr>
-        <w:t>สามารถรับการแจ้งเตือนกำหนดการประชุมล่วงหน้าตามช่วงเวลาที่กำหนด (</w:t>
+        <w:t>สามารถรับการ</w:t>
+      </w:r>
+      <w:bookmarkStart w:id="2" w:name="_Hlk228049712"/>
+      <w:r>
+        <w:rPr>
+          <w:rFonts w:ascii="TH SarabunPSK" w:eastAsia="Times New Roman" w:hAnsi="TH SarabunPSK" w:cs="TH SarabunPSK"/>
+          <w:kern w:val="0"/>
+          <w:sz w:val="32"/>
+          <w:szCs w:val="32"/>
+          <w:cs/>
+          <w14:ligatures w14:val="none"/>
+        </w:rPr>
+        <w:t>แจ้งเตือนกำหนดการประชุมล่วงหน้า</w:t>
+      </w:r>
+      <w:bookmarkEnd w:id="2"/>
+      <w:r>
+        <w:rPr>
+          <w:rFonts w:ascii="TH SarabunPSK" w:eastAsia="Times New Roman" w:hAnsi="TH SarabunPSK" w:cs="TH SarabunPSK"/>
+          <w:kern w:val="0"/>
+          <w:sz w:val="32"/>
+          <w:szCs w:val="32"/>
+          <w:cs/>
+          <w14:ligatures w14:val="none"/>
+        </w:rPr>
+        <w:t>ตามช่วงเวลาที่กำหนด (</w:t>
       </w:r>
       <w:r>
         <w:rPr>
@@ -3446,7 +3507,31 @@
           <w:cs/>
           <w14:ligatures w14:val="none"/>
         </w:rPr>
-        <w:t>สามารถสืบค้นข้อมูลองค์กร ระเบียบปฏิบัติ หรือข้อมูลทั่วไปผ่านตัวแทนปัญญาประดิษฐ์ (</w:t>
+        <w:t>สามารถ</w:t>
+      </w:r>
+      <w:bookmarkStart w:id="3" w:name="_Hlk228047172"/>
+      <w:r>
+        <w:rPr>
+          <w:rFonts w:ascii="TH SarabunPSK" w:eastAsia="Times New Roman" w:hAnsi="TH SarabunPSK" w:cs="TH SarabunPSK"/>
+          <w:kern w:val="0"/>
+          <w:sz w:val="32"/>
+          <w:szCs w:val="32"/>
+          <w:cs/>
+          <w14:ligatures w14:val="none"/>
+        </w:rPr>
+        <w:t xml:space="preserve">สืบค้นข้อมูลองค์กร </w:t>
+      </w:r>
+      <w:bookmarkEnd w:id="3"/>
+      <w:r>
+        <w:rPr>
+          <w:rFonts w:ascii="TH SarabunPSK" w:eastAsia="Times New Roman" w:hAnsi="TH SarabunPSK" w:cs="TH SarabunPSK"/>
+          <w:kern w:val="0"/>
+          <w:sz w:val="32"/>
+          <w:szCs w:val="32"/>
+          <w:cs/>
+          <w14:ligatures w14:val="none"/>
+        </w:rPr>
+        <w:t>ระเบียบปฏิบัติ หรือข้อมูลทั่วไปผ่านตัวแทนปัญญาประดิษฐ์ (</w:t>
       </w:r>
       <w:r>
         <w:rPr>
@@ -3568,7 +3653,31 @@
           <w:cs/>
           <w14:ligatures w14:val="none"/>
         </w:rPr>
-        <w:t xml:space="preserve">สามารถนำเข้าข้อมูลในรูปแบบไฟล์ภาพผ่าน </w:t>
+        <w:t>สามารถ</w:t>
+      </w:r>
+      <w:bookmarkStart w:id="4" w:name="_Hlk228047200"/>
+      <w:r>
+        <w:rPr>
+          <w:rFonts w:ascii="TH SarabunPSK" w:eastAsia="Times New Roman" w:hAnsi="TH SarabunPSK" w:cs="TH SarabunPSK"/>
+          <w:kern w:val="0"/>
+          <w:sz w:val="32"/>
+          <w:szCs w:val="32"/>
+          <w:cs/>
+          <w14:ligatures w14:val="none"/>
+        </w:rPr>
+        <w:t>นำเข้าข้อมูลในรูปแบบไฟล์ภาพ</w:t>
+      </w:r>
+      <w:bookmarkEnd w:id="4"/>
+      <w:r>
+        <w:rPr>
+          <w:rFonts w:ascii="TH SarabunPSK" w:eastAsia="Times New Roman" w:hAnsi="TH SarabunPSK" w:cs="TH SarabunPSK"/>
+          <w:kern w:val="0"/>
+          <w:sz w:val="32"/>
+          <w:szCs w:val="32"/>
+          <w:cs/>
+          <w14:ligatures w14:val="none"/>
+        </w:rPr>
+        <w:t xml:space="preserve">ผ่าน </w:t>
       </w:r>
       <w:r>
         <w:rPr>
@@ -3692,7 +3801,44 @@
           <w:cs/>
           <w14:ligatures w14:val="none"/>
         </w:rPr>
-        <w:t>สามารถเข้าถึงและดาวน์โหลดเอกสารสรุปการจ่ายเงินเดือน (</w:t>
+        <w:t>สามารถ</w:t>
+      </w:r>
+      <w:bookmarkStart w:id="5" w:name="_Hlk228047284"/>
+      <w:r>
+        <w:rPr>
+          <w:rFonts w:ascii="TH SarabunPSK" w:eastAsia="Times New Roman" w:hAnsi="TH SarabunPSK" w:cs="TH SarabunPSK"/>
+          <w:kern w:val="0"/>
+          <w:sz w:val="32"/>
+          <w:szCs w:val="32"/>
+          <w:cs/>
+          <w14:ligatures w14:val="none"/>
+        </w:rPr>
+        <w:t>เข้าถึงและ</w:t>
+      </w:r>
+      <w:bookmarkStart w:id="6" w:name="_Hlk228047233"/>
+      <w:r>
+        <w:rPr>
+          <w:rFonts w:ascii="TH SarabunPSK" w:eastAsia="Times New Roman" w:hAnsi="TH SarabunPSK" w:cs="TH SarabunPSK"/>
+          <w:kern w:val="0"/>
+          <w:sz w:val="32"/>
+          <w:szCs w:val="32"/>
+          <w:cs/>
+          <w14:ligatures w14:val="none"/>
+        </w:rPr>
+        <w:t>ดาวน์โหลดเอกสารสรุปการจ่ายเงินเดือน</w:t>
+      </w:r>
+      <w:bookmarkEnd w:id="5"/>
+      <w:bookmarkEnd w:id="6"/>
+      <w:r>
+        <w:rPr>
+          <w:rFonts w:ascii="TH SarabunPSK" w:eastAsia="Times New Roman" w:hAnsi="TH SarabunPSK" w:cs="TH SarabunPSK"/>
+          <w:kern w:val="0"/>
+          <w:sz w:val="32"/>
+          <w:szCs w:val="32"/>
+          <w:cs/>
+          <w14:ligatures w14:val="none"/>
+        </w:rPr>
+        <w:t xml:space="preserve"> (</w:t>
       </w:r>
       <w:proofErr w:type="spellStart"/>
       <w:r>
@@ -3725,7 +3871,31 @@
           <w:cs/>
           <w14:ligatures w14:val="none"/>
         </w:rPr>
-        <w:t xml:space="preserve">และหนังสือรับรองการหักภาษี ณ ที่จ่าย (ทวิ </w:t>
+        <w:t>และ</w:t>
+      </w:r>
+      <w:bookmarkStart w:id="7" w:name="_Hlk228049352"/>
+      <w:r>
+        <w:rPr>
+          <w:rFonts w:ascii="TH SarabunPSK" w:eastAsia="Times New Roman" w:hAnsi="TH SarabunPSK" w:cs="TH SarabunPSK"/>
+          <w:kern w:val="0"/>
+          <w:sz w:val="32"/>
+          <w:szCs w:val="32"/>
+          <w:cs/>
+          <w14:ligatures w14:val="none"/>
+        </w:rPr>
+        <w:t>หนังสือรับรองการหักภาษี ณ ที่จ่าย</w:t>
+      </w:r>
+      <w:bookmarkEnd w:id="7"/>
+      <w:r>
+        <w:rPr>
+          <w:rFonts w:ascii="TH SarabunPSK" w:eastAsia="Times New Roman" w:hAnsi="TH SarabunPSK" w:cs="TH SarabunPSK"/>
+          <w:kern w:val="0"/>
+          <w:sz w:val="32"/>
+          <w:szCs w:val="32"/>
+          <w:cs/>
+          <w14:ligatures w14:val="none"/>
+        </w:rPr>
+        <w:t xml:space="preserve"> (ทวิ </w:t>
       </w:r>
       <w:r>
         <w:rPr>
@@ -3818,7 +3988,31 @@
           <w:cs/>
           <w14:ligatures w14:val="none"/>
         </w:rPr>
-        <w:t>สามารถรับข้อมูลข่าวสารประชาสัมพันธ์ที่คัดกรองเฉพาะสำหรับแผนกหรือ</w:t>
+        <w:t>สามารถรับข้อมูล</w:t>
+      </w:r>
+      <w:bookmarkStart w:id="8" w:name="_Hlk228049744"/>
+      <w:r>
+        <w:rPr>
+          <w:rFonts w:ascii="TH SarabunPSK" w:eastAsia="Times New Roman" w:hAnsi="TH SarabunPSK" w:cs="TH SarabunPSK"/>
+          <w:kern w:val="0"/>
+          <w:sz w:val="32"/>
+          <w:szCs w:val="32"/>
+          <w:cs/>
+          <w14:ligatures w14:val="none"/>
+        </w:rPr>
+        <w:t>ข่าวสารประชาสัมพันธ์</w:t>
+      </w:r>
+      <w:bookmarkEnd w:id="8"/>
+      <w:r>
+        <w:rPr>
+          <w:rFonts w:ascii="TH SarabunPSK" w:eastAsia="Times New Roman" w:hAnsi="TH SarabunPSK" w:cs="TH SarabunPSK"/>
+          <w:kern w:val="0"/>
+          <w:sz w:val="32"/>
+          <w:szCs w:val="32"/>
+          <w:cs/>
+          <w14:ligatures w14:val="none"/>
+        </w:rPr>
+        <w:t>ที่คัดกรองเฉพาะสำหรับแผนกหรือ</w:t>
       </w:r>
       <w:r>
         <w:rPr>
@@ -3843,7 +4037,7 @@
         <w:spacing w:after="0"/>
         <w:jc w:val="thaiDistribute"/>
         <w:rPr>
-          <w:rFonts w:ascii="TH SarabunPSK" w:eastAsia="Times New Roman" w:hAnsi="TH SarabunPSK" w:cs="TH SarabunPSK" w:hint="cs"/>
+          <w:rFonts w:ascii="TH SarabunPSK" w:eastAsia="Times New Roman" w:hAnsi="TH SarabunPSK" w:cs="TH SarabunPSK"/>
           <w:kern w:val="0"/>
           <w:sz w:val="32"/>
           <w:szCs w:val="32"/>
@@ -3912,7 +4106,31 @@
           <w:cs/>
           <w14:ligatures w14:val="none"/>
         </w:rPr>
-        <w:t>สามารถบันทึกเวลาการปฏิบัติงาน (เข้างานและออกงาน) รวมถึงลา</w:t>
+        <w:t>สามารถ</w:t>
+      </w:r>
+      <w:bookmarkStart w:id="9" w:name="_Hlk228047311"/>
+      <w:r>
+        <w:rPr>
+          <w:rFonts w:ascii="TH SarabunPSK" w:eastAsia="Times New Roman" w:hAnsi="TH SarabunPSK" w:cs="TH SarabunPSK"/>
+          <w:kern w:val="0"/>
+          <w:sz w:val="32"/>
+          <w:szCs w:val="32"/>
+          <w:cs/>
+          <w14:ligatures w14:val="none"/>
+        </w:rPr>
+        <w:t xml:space="preserve">บันทึกเวลาการปฏิบัติงาน </w:t>
+      </w:r>
+      <w:bookmarkEnd w:id="9"/>
+      <w:r>
+        <w:rPr>
+          <w:rFonts w:ascii="TH SarabunPSK" w:eastAsia="Times New Roman" w:hAnsi="TH SarabunPSK" w:cs="TH SarabunPSK"/>
+          <w:kern w:val="0"/>
+          <w:sz w:val="32"/>
+          <w:szCs w:val="32"/>
+          <w:cs/>
+          <w14:ligatures w14:val="none"/>
+        </w:rPr>
+        <w:t>(เข้างานและออกงาน) รวมถึงลา</w:t>
       </w:r>
       <w:r>
         <w:rPr>
@@ -4020,7 +4238,31 @@
           <w:cs/>
           <w14:ligatures w14:val="none"/>
         </w:rPr>
-        <w:t>สามารถตรวจสอบข้อมูลประวัติการถูกหักคะแนนความประพฤติและสถานะคะแนนเสียสะสมของตนเองได้</w:t>
+        <w:t>สามารถ</w:t>
+      </w:r>
+      <w:bookmarkStart w:id="10" w:name="_Hlk228047374"/>
+      <w:r>
+        <w:rPr>
+          <w:rFonts w:ascii="TH SarabunPSK" w:eastAsia="Times New Roman" w:hAnsi="TH SarabunPSK" w:cs="TH SarabunPSK"/>
+          <w:kern w:val="0"/>
+          <w:sz w:val="32"/>
+          <w:szCs w:val="32"/>
+          <w:cs/>
+          <w14:ligatures w14:val="none"/>
+        </w:rPr>
+        <w:t>ตรวจสอบข้อมูลประวัติการถูกหักคะแนน</w:t>
+      </w:r>
+      <w:bookmarkEnd w:id="10"/>
+      <w:r>
+        <w:rPr>
+          <w:rFonts w:ascii="TH SarabunPSK" w:eastAsia="Times New Roman" w:hAnsi="TH SarabunPSK" w:cs="TH SarabunPSK"/>
+          <w:kern w:val="0"/>
+          <w:sz w:val="32"/>
+          <w:szCs w:val="32"/>
+          <w:cs/>
+          <w14:ligatures w14:val="none"/>
+        </w:rPr>
+        <w:t>ความประพฤติและสถานะคะแนนเสียสะสมของตนเองได้</w:t>
       </w:r>
     </w:p>
     <w:p>
@@ -4117,7 +4359,31 @@
           <w:cs/>
           <w14:ligatures w14:val="none"/>
         </w:rPr>
-        <w:t>สามารถร้องขอและเข้าถึงเอกสารสัญญาจ้างงาน (</w:t>
+        <w:t>สามารถร้องขอและ</w:t>
+      </w:r>
+      <w:bookmarkStart w:id="11" w:name="_Hlk228049390"/>
+      <w:r>
+        <w:rPr>
+          <w:rFonts w:ascii="TH SarabunPSK" w:eastAsia="Times New Roman" w:hAnsi="TH SarabunPSK" w:cs="TH SarabunPSK"/>
+          <w:kern w:val="0"/>
+          <w:sz w:val="32"/>
+          <w:szCs w:val="32"/>
+          <w:cs/>
+          <w14:ligatures w14:val="none"/>
+        </w:rPr>
+        <w:t>เข้าถึงเอกสารสัญญาจ้างงาน</w:t>
+      </w:r>
+      <w:bookmarkEnd w:id="11"/>
+      <w:r>
+        <w:rPr>
+          <w:rFonts w:ascii="TH SarabunPSK" w:eastAsia="Times New Roman" w:hAnsi="TH SarabunPSK" w:cs="TH SarabunPSK"/>
+          <w:kern w:val="0"/>
+          <w:sz w:val="32"/>
+          <w:szCs w:val="32"/>
+          <w:cs/>
+          <w14:ligatures w14:val="none"/>
+        </w:rPr>
+        <w:t xml:space="preserve"> (</w:t>
       </w:r>
       <w:r>
         <w:rPr>
@@ -4152,7 +4418,7 @@
         <w:spacing w:after="0"/>
         <w:jc w:val="thaiDistribute"/>
         <w:rPr>
-          <w:rFonts w:ascii="TH SarabunPSK" w:eastAsia="Times New Roman" w:hAnsi="TH SarabunPSK" w:cs="TH SarabunPSK" w:hint="cs"/>
+          <w:rFonts w:ascii="TH SarabunPSK" w:eastAsia="Times New Roman" w:hAnsi="TH SarabunPSK" w:cs="TH SarabunPSK"/>
           <w:kern w:val="0"/>
           <w:sz w:val="32"/>
           <w:szCs w:val="32"/>
@@ -4235,8 +4501,21 @@
           <w:cs/>
           <w14:ligatures w14:val="none"/>
         </w:rPr>
-        <w:t>สามารถรับการแจ้งเตือนเมื่อมีการบันทึกหักคะแนนความประพฤติ</w:t>
-      </w:r>
+        <w:t>สามารถรับการแจ้งเตือนเมื่อมี</w:t>
+      </w:r>
+      <w:bookmarkStart w:id="12" w:name="_Hlk228049789"/>
+      <w:r>
+        <w:rPr>
+          <w:rFonts w:ascii="TH SarabunPSK" w:eastAsia="Times New Roman" w:hAnsi="TH SarabunPSK" w:cs="TH SarabunPSK"/>
+          <w:kern w:val="0"/>
+          <w:sz w:val="32"/>
+          <w:szCs w:val="32"/>
+          <w:cs/>
+          <w14:ligatures w14:val="none"/>
+        </w:rPr>
+        <w:t>การบันทึกหักคะแนนความประพฤติ</w:t>
+      </w:r>
+      <w:bookmarkEnd w:id="12"/>
     </w:p>
     <w:p>
       <w:pPr>
@@ -4301,6 +4580,7 @@
         </w:rPr>
         <w:t>**</w:t>
       </w:r>
+      <w:bookmarkStart w:id="13" w:name="_Hlk228042345"/>
       <w:r>
         <w:rPr>
           <w:rFonts w:ascii="TH SarabunPSK" w:eastAsia="Times New Roman" w:hAnsi="TH SarabunPSK" w:cs="TH SarabunPSK"/>
@@ -4322,6 +4602,7 @@
         </w:rPr>
         <w:t>HR)</w:t>
       </w:r>
+      <w:bookmarkEnd w:id="13"/>
     </w:p>
     <w:p>
       <w:pPr>
@@ -4385,6 +4666,7 @@
         </w:rPr>
         <w:tab/>
       </w:r>
+      <w:bookmarkStart w:id="14" w:name="_Hlk228042360"/>
       <w:r>
         <w:rPr>
           <w:rFonts w:ascii="TH SarabunPSK" w:eastAsia="Times New Roman" w:hAnsi="TH SarabunPSK" w:cs="TH SarabunPSK"/>
@@ -4702,7 +4984,31 @@
           <w:cs/>
           <w14:ligatures w14:val="none"/>
         </w:rPr>
-        <w:t xml:space="preserve">และหนังสือรับรองการหักภาษี ณ ที่จ่าย (ทวิ </w:t>
+        <w:t>และ</w:t>
+      </w:r>
+      <w:bookmarkStart w:id="15" w:name="_Hlk228044927"/>
+      <w:r>
+        <w:rPr>
+          <w:rFonts w:ascii="TH SarabunPSK" w:eastAsia="Times New Roman" w:hAnsi="TH SarabunPSK" w:cs="TH SarabunPSK"/>
+          <w:kern w:val="0"/>
+          <w:sz w:val="32"/>
+          <w:szCs w:val="32"/>
+          <w:cs/>
+          <w14:ligatures w14:val="none"/>
+        </w:rPr>
+        <w:t>หนังสือรับรองการหักภาษี ณ ที่จ่าย</w:t>
+      </w:r>
+      <w:bookmarkEnd w:id="15"/>
+      <w:r>
+        <w:rPr>
+          <w:rFonts w:ascii="TH SarabunPSK" w:eastAsia="Times New Roman" w:hAnsi="TH SarabunPSK" w:cs="TH SarabunPSK"/>
+          <w:kern w:val="0"/>
+          <w:sz w:val="32"/>
+          <w:szCs w:val="32"/>
+          <w:cs/>
+          <w14:ligatures w14:val="none"/>
+        </w:rPr>
+        <w:t xml:space="preserve"> (ทวิ </w:t>
       </w:r>
       <w:r>
         <w:rPr>
@@ -4940,12 +5246,13 @@
         <w:t>สามารถดำเนินการบันทึกประวัติและหักคะแนนความประพฤติของบุคลากร</w:t>
       </w:r>
     </w:p>
+    <w:bookmarkEnd w:id="14"/>
     <w:p>
       <w:pPr>
         <w:spacing w:after="0"/>
         <w:jc w:val="both"/>
         <w:rPr>
-          <w:rFonts w:ascii="TH SarabunPSK" w:eastAsia="Times New Roman" w:hAnsi="TH SarabunPSK" w:cs="TH SarabunPSK" w:hint="cs"/>
+          <w:rFonts w:ascii="TH SarabunPSK" w:eastAsia="Times New Roman" w:hAnsi="TH SarabunPSK" w:cs="TH SarabunPSK"/>
           <w:kern w:val="0"/>
           <w:sz w:val="32"/>
           <w:szCs w:val="32"/>
@@ -6448,7 +6755,7 @@
     <w:p>
       <w:pPr>
         <w:rPr>
-          <w:rFonts w:ascii="TH SarabunPSK" w:eastAsia="Times New Roman" w:hAnsi="TH SarabunPSK" w:cs="TH SarabunPSK" w:hint="cs"/>
+          <w:rFonts w:ascii="TH SarabunPSK" w:eastAsia="Times New Roman" w:hAnsi="TH SarabunPSK" w:cs="TH SarabunPSK"/>
           <w:color w:val="000000"/>
           <w:kern w:val="0"/>
           <w:sz w:val="32"/>

</xml_diff>